<commit_message>
Actualizeaza documentatia: meniu, dificultati, culori, logging si teste
Regenereaza docs/Documentatie.docx (via gen_doc.py) ca sa reflecte starea
actuala a proiectului:
- 4.2 meniul principal (PLAY/EXIT) + selectia dificultatii (EASY 5 / NORMAL 10
  / HARD 20) + ecranele de victorie si Game Over; 4.3 comenzi pentru meniuri.
- 9.1 colorarea fundalului (marcaje galbene, pereti gri, stop alb, iarba verde).
- 7.8 clasa Meniu, 7.9 clasa Logger (jurnal de evenimente, RAII, exemplu .log).
- 12.1 teste unitare reale (Test.h, 4 fisiere, 60 de verificari) + actualizat
  capitolul de testare (de la directie de viitor la teste implementate).
- Module noi in arhitectura (Meniu, Logger), etapele 5 si 6, UML actualizat,
  cerinte obligatorii/facultative si capitolul de imbunatatiri actualizate.

Co-Authored-By: Claude Opus 4.8 <noreply@anthropic.com>
</commit_message>
<xml_diff>
--- a/docs/Documentatie.docx
+++ b/docs/Documentatie.docx
@@ -474,7 +474,37 @@
               <w:rPr>
                 <w:sz w:val="22"/>
               </w:rPr>
-              <w:t>Detectate în bucla de joc (intrare în box, trecere reușită, coliziune)</w:t>
+              <w:t>Detectate în bucla de joc și jurnalizate într-un fișier .log de clasa Logger</w:t>
+            </w:r>
+          </w:p>
+        </w:tc>
+      </w:tr>
+      <w:tr>
+        <w:tc>
+          <w:tcPr>
+            <w:tcW w:type="dxa" w:w="3969"/>
+          </w:tcPr>
+          <w:p>
+            <w:r/>
+            <w:r>
+              <w:rPr>
+                <w:sz w:val="22"/>
+              </w:rPr>
+              <w:t>Testare unitară</w:t>
+            </w:r>
+          </w:p>
+        </w:tc>
+        <w:tc>
+          <w:tcPr>
+            <w:tcW w:type="dxa" w:w="5102"/>
+          </w:tcPr>
+          <w:p>
+            <w:r/>
+            <w:r>
+              <w:rPr>
+                <w:sz w:val="22"/>
+              </w:rPr>
+              <w:t>Director tests/ cu micro-framework propriu; teste pentru vehicule, reguli, hartă, jurnal</w:t>
             </w:r>
           </w:p>
         </w:tc>
@@ -527,7 +557,7 @@
           <w:b w:val="0"/>
           <w:i w:val="0"/>
         </w:rPr>
-        <w:t>Dintre cerințele facultative, proiectul implementează simularea în timp real cu posibilitatea de a pune jocul pe pauză. Pattern-ul Observer și exportul în format CSV reprezintă direcții de extindere discutate în capitolul de îmbunătățiri.</w:t>
+        <w:t>Dintre cerințele facultative, proiectul implementează: un meniu principal cu selectarea nivelului de dificultate, simularea în timp real cu posibilitatea de a pune jocul pe pauză și jurnalizarea evenimentelor de joc într-un fișier .log. Pattern-ul Observer și exportul statisticilor în format CSV reprezintă direcții de extindere discutate în capitolul de îmbunătățiri.</w:t>
       </w:r>
     </w:p>
     <w:p>
@@ -842,7 +872,185 @@
         <w:pStyle w:val="Heading2"/>
       </w:pPr>
       <w:r>
-        <w:t>4.2. Comenzi</w:t>
+        <w:t>4.2. Meniul principal și nivelul de dificultate</w:t>
+      </w:r>
+    </w:p>
+    <w:p>
+      <w:pPr>
+        <w:jc w:val="both"/>
+      </w:pPr>
+      <w:r>
+        <w:rPr>
+          <w:b w:val="0"/>
+          <w:i w:val="0"/>
+        </w:rPr>
+        <w:t>La pornire, jocul afișează un meniu principal în stil clasic, cu butoane dreptunghiulare desenate din caractere, între care jucătorul navighează cu tastele sus/jos (sau W/S) și confirmă cu Enter sau Space. Meniul principal oferă două opțiuni: PLAY (pornește o partidă) și EXIT (închide jocul).</w:t>
+      </w:r>
+    </w:p>
+    <w:p>
+      <w:pPr>
+        <w:jc w:val="both"/>
+      </w:pPr>
+      <w:r>
+        <w:rPr>
+          <w:b w:val="0"/>
+          <w:i w:val="0"/>
+        </w:rPr>
+        <w:t>După alegerea opțiunii PLAY, un al doilea meniu permite selectarea nivelului de dificultate, care stabilește câte intersecții trebuie traversate pentru a câștiga partida:</w:t>
+      </w:r>
+    </w:p>
+    <w:tbl>
+      <w:tblPr>
+        <w:tblStyle w:val="LightGrid-Accent1"/>
+        <w:tblW w:type="auto" w:w="0"/>
+        <w:jc w:val="center"/>
+        <w:tblLook w:firstColumn="1" w:firstRow="1" w:lastColumn="0" w:lastRow="0" w:noHBand="0" w:noVBand="1" w:val="04A0"/>
+      </w:tblPr>
+      <w:tblGrid>
+        <w:gridCol w:w="4536"/>
+        <w:gridCol w:w="4536"/>
+      </w:tblGrid>
+      <w:tr>
+        <w:tc>
+          <w:tcPr>
+            <w:tcW w:type="dxa" w:w="3402"/>
+          </w:tcPr>
+          <w:p>
+            <w:r/>
+            <w:r>
+              <w:rPr>
+                <w:b/>
+                <w:sz w:val="22"/>
+              </w:rPr>
+              <w:t>Dificultate</w:t>
+            </w:r>
+          </w:p>
+        </w:tc>
+        <w:tc>
+          <w:tcPr>
+            <w:tcW w:type="dxa" w:w="5669"/>
+          </w:tcPr>
+          <w:p>
+            <w:r/>
+            <w:r>
+              <w:rPr>
+                <w:b/>
+                <w:sz w:val="22"/>
+              </w:rPr>
+              <w:t>Intersecții de traversat</w:t>
+            </w:r>
+          </w:p>
+        </w:tc>
+      </w:tr>
+      <w:tr>
+        <w:tc>
+          <w:tcPr>
+            <w:tcW w:type="dxa" w:w="3402"/>
+          </w:tcPr>
+          <w:p>
+            <w:r/>
+            <w:r>
+              <w:rPr>
+                <w:sz w:val="22"/>
+              </w:rPr>
+              <w:t>EASY</w:t>
+            </w:r>
+          </w:p>
+        </w:tc>
+        <w:tc>
+          <w:tcPr>
+            <w:tcW w:type="dxa" w:w="5669"/>
+          </w:tcPr>
+          <w:p>
+            <w:r/>
+            <w:r>
+              <w:rPr>
+                <w:sz w:val="22"/>
+              </w:rPr>
+              <w:t>5 intersecții</w:t>
+            </w:r>
+          </w:p>
+        </w:tc>
+      </w:tr>
+      <w:tr>
+        <w:tc>
+          <w:tcPr>
+            <w:tcW w:type="dxa" w:w="3402"/>
+          </w:tcPr>
+          <w:p>
+            <w:r/>
+            <w:r>
+              <w:rPr>
+                <w:sz w:val="22"/>
+              </w:rPr>
+              <w:t>NORMAL</w:t>
+            </w:r>
+          </w:p>
+        </w:tc>
+        <w:tc>
+          <w:tcPr>
+            <w:tcW w:type="dxa" w:w="5669"/>
+          </w:tcPr>
+          <w:p>
+            <w:r/>
+            <w:r>
+              <w:rPr>
+                <w:sz w:val="22"/>
+              </w:rPr>
+              <w:t>10 intersecții</w:t>
+            </w:r>
+          </w:p>
+        </w:tc>
+      </w:tr>
+      <w:tr>
+        <w:tc>
+          <w:tcPr>
+            <w:tcW w:type="dxa" w:w="3402"/>
+          </w:tcPr>
+          <w:p>
+            <w:r/>
+            <w:r>
+              <w:rPr>
+                <w:sz w:val="22"/>
+              </w:rPr>
+              <w:t>HARD</w:t>
+            </w:r>
+          </w:p>
+        </w:tc>
+        <w:tc>
+          <w:tcPr>
+            <w:tcW w:type="dxa" w:w="5669"/>
+          </w:tcPr>
+          <w:p>
+            <w:r/>
+            <w:r>
+              <w:rPr>
+                <w:sz w:val="22"/>
+              </w:rPr>
+              <w:t>20 de intersecții</w:t>
+            </w:r>
+          </w:p>
+        </w:tc>
+      </w:tr>
+    </w:tbl>
+    <w:p>
+      <w:pPr>
+        <w:jc w:val="both"/>
+      </w:pPr>
+      <w:r>
+        <w:rPr>
+          <w:b w:val="0"/>
+          <w:i w:val="0"/>
+        </w:rPr>
+        <w:t>La finalul unei partide câștigate este afișat un ecran de felicitare („AI CASTIGAT!"), iar la pierderea tuturor vieților sau la încălcarea unei reguli apare ecranul „GAME OVER", cu scorul final și numărul de intersecții traversate. Din ambele ecrane, jucătorul revine la meniul principal apăsând Q sau Esc.</w:t>
+      </w:r>
+    </w:p>
+    <w:p>
+      <w:pPr>
+        <w:pStyle w:val="Heading2"/>
+      </w:pPr>
+      <w:r>
+        <w:t>4.3. Comenzi</w:t>
       </w:r>
     </w:p>
     <w:tbl>
@@ -899,6 +1107,66 @@
               <w:rPr>
                 <w:sz w:val="22"/>
               </w:rPr>
+              <w:t>Săgeată sus / jos (sau W / S)</w:t>
+            </w:r>
+          </w:p>
+        </w:tc>
+        <w:tc>
+          <w:tcPr>
+            <w:tcW w:type="dxa" w:w="5953"/>
+          </w:tcPr>
+          <w:p>
+            <w:r/>
+            <w:r>
+              <w:rPr>
+                <w:sz w:val="22"/>
+              </w:rPr>
+              <w:t>În meniuri: navigare între opțiuni</w:t>
+            </w:r>
+          </w:p>
+        </w:tc>
+      </w:tr>
+      <w:tr>
+        <w:tc>
+          <w:tcPr>
+            <w:tcW w:type="dxa" w:w="3118"/>
+          </w:tcPr>
+          <w:p>
+            <w:r/>
+            <w:r>
+              <w:rPr>
+                <w:sz w:val="22"/>
+              </w:rPr>
+              <w:t>Enter / Space</w:t>
+            </w:r>
+          </w:p>
+        </w:tc>
+        <w:tc>
+          <w:tcPr>
+            <w:tcW w:type="dxa" w:w="5953"/>
+          </w:tcPr>
+          <w:p>
+            <w:r/>
+            <w:r>
+              <w:rPr>
+                <w:sz w:val="22"/>
+              </w:rPr>
+              <w:t>În meniuri: confirmarea opțiunii selectate</w:t>
+            </w:r>
+          </w:p>
+        </w:tc>
+      </w:tr>
+      <w:tr>
+        <w:tc>
+          <w:tcPr>
+            <w:tcW w:type="dxa" w:w="3118"/>
+          </w:tcPr>
+          <w:p>
+            <w:r/>
+            <w:r>
+              <w:rPr>
+                <w:sz w:val="22"/>
+              </w:rPr>
               <w:t>W / săgeată sus</w:t>
             </w:r>
           </w:p>
@@ -913,7 +1181,7 @@
               <w:rPr>
                 <w:sz w:val="22"/>
               </w:rPr>
-              <w:t>Deplasare în sus (mașina este orientată vertical)</w:t>
+              <w:t>În joc: deplasare în sus (mașina este orientată vertical)</w:t>
             </w:r>
           </w:p>
         </w:tc>
@@ -943,7 +1211,7 @@
               <w:rPr>
                 <w:sz w:val="22"/>
               </w:rPr>
-              <w:t>Deplasare în jos</w:t>
+              <w:t>În joc: deplasare în jos</w:t>
             </w:r>
           </w:p>
         </w:tc>
@@ -973,7 +1241,7 @@
               <w:rPr>
                 <w:sz w:val="22"/>
               </w:rPr>
-              <w:t>Deplasare la stânga (sprite-ul se rotește la 90°)</w:t>
+              <w:t>În joc: deplasare la stânga (sprite-ul se rotește la 90°)</w:t>
             </w:r>
           </w:p>
         </w:tc>
@@ -1003,7 +1271,7 @@
               <w:rPr>
                 <w:sz w:val="22"/>
               </w:rPr>
-              <w:t>Deplasare la dreapta (sprite rotit)</w:t>
+              <w:t>În joc: deplasare la dreapta (sprite rotit)</w:t>
             </w:r>
           </w:p>
         </w:tc>
@@ -1063,7 +1331,7 @@
               <w:rPr>
                 <w:sz w:val="22"/>
               </w:rPr>
-              <w:t>Ieșire din joc</w:t>
+              <w:t>În joc: revenire la meniu; în meniuri: înapoi / ieșire</w:t>
             </w:r>
           </w:p>
         </w:tc>
@@ -1074,7 +1342,7 @@
         <w:pStyle w:val="Heading2"/>
       </w:pPr>
       <w:r>
-        <w:t>4.3. Regulile de circulație</w:t>
+        <w:t>4.4. Regulile de circulație</w:t>
       </w:r>
     </w:p>
     <w:p>
@@ -1112,7 +1380,7 @@
         <w:pStyle w:val="Heading2"/>
       </w:pPr>
       <w:r>
-        <w:t>4.4. Reguli suplimentare de joc</w:t>
+        <w:t>4.5. Reguli suplimentare de joc</w:t>
       </w:r>
     </w:p>
     <w:p>
@@ -1147,7 +1415,7 @@
         <w:pStyle w:val="Heading2"/>
       </w:pPr>
       <w:r>
-        <w:t>4.5. Capturi de ecran</w:t>
+        <w:t>4.6. Capturi de ecran</w:t>
       </w:r>
     </w:p>
     <w:p>
@@ -1907,7 +2175,7 @@
         <w:pStyle w:val="Heading2"/>
       </w:pPr>
       <w:r>
-        <w:t>4.6. Sprite-urile vehiculelor</w:t>
+        <w:t>4.7. Sprite-urile vehiculelor</w:t>
       </w:r>
     </w:p>
     <w:p>
@@ -2420,6 +2688,66 @@
               <w:rPr>
                 <w:sz w:val="22"/>
               </w:rPr>
+              <w:t>Meniu</w:t>
+            </w:r>
+          </w:p>
+        </w:tc>
+        <w:tc>
+          <w:tcPr>
+            <w:tcW w:type="dxa" w:w="6236"/>
+          </w:tcPr>
+          <w:p>
+            <w:r/>
+            <w:r>
+              <w:rPr>
+                <w:sz w:val="22"/>
+              </w:rPr>
+              <w:t>Meniuri în stil clasic (butoane), navigare și selecția opțiunilor</w:t>
+            </w:r>
+          </w:p>
+        </w:tc>
+      </w:tr>
+      <w:tr>
+        <w:tc>
+          <w:tcPr>
+            <w:tcW w:type="dxa" w:w="2835"/>
+          </w:tcPr>
+          <w:p>
+            <w:r/>
+            <w:r>
+              <w:rPr>
+                <w:sz w:val="22"/>
+              </w:rPr>
+              <w:t>Logger</w:t>
+            </w:r>
+          </w:p>
+        </w:tc>
+        <w:tc>
+          <w:tcPr>
+            <w:tcW w:type="dxa" w:w="6236"/>
+          </w:tcPr>
+          <w:p>
+            <w:r/>
+            <w:r>
+              <w:rPr>
+                <w:sz w:val="22"/>
+              </w:rPr>
+              <w:t>Jurnalizarea evenimentelor de joc într-un fișier .log</w:t>
+            </w:r>
+          </w:p>
+        </w:tc>
+      </w:tr>
+      <w:tr>
+        <w:tc>
+          <w:tcPr>
+            <w:tcW w:type="dxa" w:w="2835"/>
+          </w:tcPr>
+          <w:p>
+            <w:r/>
+            <w:r>
+              <w:rPr>
+                <w:sz w:val="22"/>
+              </w:rPr>
               <w:t>Joc</w:t>
             </w:r>
           </w:p>
@@ -2743,6 +3071,66 @@
           </w:p>
         </w:tc>
       </w:tr>
+      <w:tr>
+        <w:tc>
+          <w:tcPr>
+            <w:tcW w:type="dxa" w:w="2551"/>
+          </w:tcPr>
+          <w:p>
+            <w:r/>
+            <w:r>
+              <w:rPr>
+                <w:sz w:val="22"/>
+              </w:rPr>
+              <w:t>5 — Meniu și prezentare</w:t>
+            </w:r>
+          </w:p>
+        </w:tc>
+        <w:tc>
+          <w:tcPr>
+            <w:tcW w:type="dxa" w:w="6520"/>
+          </w:tcPr>
+          <w:p>
+            <w:r/>
+            <w:r>
+              <w:rPr>
+                <w:sz w:val="22"/>
+              </w:rPr>
+              <w:t>Meniu principal (PLAY/EXIT), selecția dificultății, ecran de victorie, culori pe fundal</w:t>
+            </w:r>
+          </w:p>
+        </w:tc>
+      </w:tr>
+      <w:tr>
+        <w:tc>
+          <w:tcPr>
+            <w:tcW w:type="dxa" w:w="2551"/>
+          </w:tcPr>
+          <w:p>
+            <w:r/>
+            <w:r>
+              <w:rPr>
+                <w:sz w:val="22"/>
+              </w:rPr>
+              <w:t>6 — Jurnal și teste</w:t>
+            </w:r>
+          </w:p>
+        </w:tc>
+        <w:tc>
+          <w:tcPr>
+            <w:tcW w:type="dxa" w:w="6520"/>
+          </w:tcPr>
+          <w:p>
+            <w:r/>
+            <w:r>
+              <w:rPr>
+                <w:sz w:val="22"/>
+              </w:rPr>
+              <w:t>Jurnalizarea evenimentelor în fișier (clasa Logger) și teste unitare în tests/</w:t>
+            </w:r>
+          </w:p>
+        </w:tc>
+      </w:tr>
     </w:tbl>
     <w:p>
       <w:pPr>
@@ -3007,7 +3395,33 @@
           <w:rFonts w:ascii="Consolas" w:hAnsi="Consolas"/>
           <w:sz w:val="20"/>
         </w:rPr>
-        <w:t xml:space="preserve">  Joc  ◇── Ecran , Input</w:t>
+        <w:t xml:space="preserve">  Joc  ◇── Ecran , Input , Logger</w:t>
+      </w:r>
+    </w:p>
+    <w:p>
+      <w:pPr>
+        <w:spacing w:after="0" w:line="240" w:lineRule="auto"/>
+        <w:shd w:val="clear" w:color="auto" w:fill="FBFBF0"/>
+      </w:pPr>
+      <w:r>
+        <w:rPr>
+          <w:rFonts w:ascii="Consolas" w:hAnsi="Consolas"/>
+          <w:sz w:val="20"/>
+        </w:rPr>
+        <w:t xml:space="preserve"> </w:t>
+      </w:r>
+    </w:p>
+    <w:p>
+      <w:pPr>
+        <w:spacing w:after="0" w:line="240" w:lineRule="auto"/>
+        <w:shd w:val="clear" w:color="auto" w:fill="FBFBF0"/>
+      </w:pPr>
+      <w:r>
+        <w:rPr>
+          <w:rFonts w:ascii="Consolas" w:hAnsi="Consolas"/>
+          <w:sz w:val="20"/>
+        </w:rPr>
+        <w:t xml:space="preserve">  Meniu ──&gt; Ecran , Input   (foloseste)</w:t>
       </w:r>
     </w:p>
     <w:p>
@@ -4396,6 +4810,240 @@
       </w:r>
     </w:p>
     <w:p>
+      <w:pPr>
+        <w:pStyle w:val="Heading2"/>
+      </w:pPr>
+      <w:r>
+        <w:t>7.8. Clasa Meniu</w:t>
+      </w:r>
+    </w:p>
+    <w:p>
+      <w:pPr>
+        <w:jc w:val="both"/>
+      </w:pPr>
+      <w:r>
+        <w:rPr>
+          <w:b w:val="0"/>
+          <w:i w:val="0"/>
+        </w:rPr>
+        <w:t>Meniu desenează meniurile în stil clasic, cu butoane dreptunghiulare construite din caractere. Primește, prin referință, obiectele Ecran și Input (nu le deține — relație de asociere), iar metoda alege() afișează un titlu și o listă de opțiuni, gestionează navigarea cu sus/jos (sau W/S) și returnează indexul opțiunii confirmate cu Enter/Space, sau −1 dacă s-a apăsat Q/Esc. Clasa este folosită atât pentru meniul principal (PLAY/EXIT), cât și pentru selecția dificultății.</w:t>
+      </w:r>
+    </w:p>
+    <w:p>
+      <w:pPr>
+        <w:spacing w:after="0" w:line="240" w:lineRule="auto"/>
+        <w:shd w:val="clear" w:color="auto" w:fill="F4F4F4"/>
+      </w:pPr>
+      <w:r>
+        <w:rPr>
+          <w:rFonts w:ascii="Consolas" w:hAnsi="Consolas"/>
+          <w:sz w:val="18"/>
+        </w:rPr>
+        <w:t>class Meniu {</w:t>
+      </w:r>
+    </w:p>
+    <w:p>
+      <w:pPr>
+        <w:spacing w:after="0" w:line="240" w:lineRule="auto"/>
+        <w:shd w:val="clear" w:color="auto" w:fill="F4F4F4"/>
+      </w:pPr>
+      <w:r>
+        <w:rPr>
+          <w:rFonts w:ascii="Consolas" w:hAnsi="Consolas"/>
+          <w:sz w:val="18"/>
+        </w:rPr>
+        <w:t xml:space="preserve">    Ecran&amp; ecran_;   // folosite prin referinta (asociere)</w:t>
+      </w:r>
+    </w:p>
+    <w:p>
+      <w:pPr>
+        <w:spacing w:after="0" w:line="240" w:lineRule="auto"/>
+        <w:shd w:val="clear" w:color="auto" w:fill="F4F4F4"/>
+      </w:pPr>
+      <w:r>
+        <w:rPr>
+          <w:rFonts w:ascii="Consolas" w:hAnsi="Consolas"/>
+          <w:sz w:val="18"/>
+        </w:rPr>
+        <w:t xml:space="preserve">    Input&amp; input_;</w:t>
+      </w:r>
+    </w:p>
+    <w:p>
+      <w:pPr>
+        <w:spacing w:after="0" w:line="240" w:lineRule="auto"/>
+        <w:shd w:val="clear" w:color="auto" w:fill="F4F4F4"/>
+      </w:pPr>
+      <w:r>
+        <w:rPr>
+          <w:rFonts w:ascii="Consolas" w:hAnsi="Consolas"/>
+          <w:sz w:val="18"/>
+        </w:rPr>
+        <w:t>public:</w:t>
+      </w:r>
+    </w:p>
+    <w:p>
+      <w:pPr>
+        <w:spacing w:after="0" w:line="240" w:lineRule="auto"/>
+        <w:shd w:val="clear" w:color="auto" w:fill="F4F4F4"/>
+      </w:pPr>
+      <w:r>
+        <w:rPr>
+          <w:rFonts w:ascii="Consolas" w:hAnsi="Consolas"/>
+          <w:sz w:val="18"/>
+        </w:rPr>
+        <w:t xml:space="preserve">    // -1 daca s-a apasat Q/Esc, altfel indexul optiunii alese</w:t>
+      </w:r>
+    </w:p>
+    <w:p>
+      <w:pPr>
+        <w:spacing w:after="0" w:line="240" w:lineRule="auto"/>
+        <w:shd w:val="clear" w:color="auto" w:fill="F4F4F4"/>
+      </w:pPr>
+      <w:r>
+        <w:rPr>
+          <w:rFonts w:ascii="Consolas" w:hAnsi="Consolas"/>
+          <w:sz w:val="18"/>
+        </w:rPr>
+        <w:t xml:space="preserve">    int alege(const std::string&amp; titlu,</w:t>
+      </w:r>
+    </w:p>
+    <w:p>
+      <w:pPr>
+        <w:spacing w:after="0" w:line="240" w:lineRule="auto"/>
+        <w:shd w:val="clear" w:color="auto" w:fill="F4F4F4"/>
+      </w:pPr>
+      <w:r>
+        <w:rPr>
+          <w:rFonts w:ascii="Consolas" w:hAnsi="Consolas"/>
+          <w:sz w:val="18"/>
+        </w:rPr>
+        <w:t xml:space="preserve">              const std::vector&lt;std::string&gt;&amp; optiuni);</w:t>
+      </w:r>
+    </w:p>
+    <w:p>
+      <w:pPr>
+        <w:spacing w:after="0" w:line="240" w:lineRule="auto"/>
+        <w:shd w:val="clear" w:color="auto" w:fill="F4F4F4"/>
+      </w:pPr>
+      <w:r>
+        <w:rPr>
+          <w:rFonts w:ascii="Consolas" w:hAnsi="Consolas"/>
+          <w:sz w:val="18"/>
+        </w:rPr>
+        <w:t>};</w:t>
+      </w:r>
+    </w:p>
+    <w:p>
+      <w:pPr>
+        <w:pStyle w:val="Heading2"/>
+      </w:pPr>
+      <w:r>
+        <w:t>7.9. Clasa Logger</w:t>
+      </w:r>
+    </w:p>
+    <w:p>
+      <w:pPr>
+        <w:jc w:val="both"/>
+      </w:pPr>
+      <w:r>
+        <w:rPr>
+          <w:b w:val="0"/>
+          <w:i w:val="0"/>
+        </w:rPr>
+        <w:t>Logger implementează jurnalizarea evenimentelor de joc într-un fișier text (cod_rutier.log). Clasa este un bun exemplu de gestionare a resurselor prin RAII: fișierul este deschis în constructor (în mod „append", pentru a păstra istoricul între rulări) și închis automat în destructor, unde se scrie și un marcaj de final de sesiune. Fiecare apel al metodei eveniment() scrie o linie cu marcă temporală, golind imediat buffer-ul, astfel încât jurnalul să rămână complet chiar dacă jocul se închide brusc. Dacă fișierul nu poate fi deschis, logger-ul devine inactiv, fără a arunca excepții.</w:t>
+      </w:r>
+    </w:p>
+    <w:p>
+      <w:pPr>
+        <w:jc w:val="both"/>
+      </w:pPr>
+      <w:r>
+        <w:rPr>
+          <w:b w:val="0"/>
+          <w:i w:val="0"/>
+        </w:rPr>
+        <w:t>În bucla de joc, Logger înregistrează momentele importante: începutul unei partide, intrarea permisă în intersecție, traversarea reușită, trecerea la un nivel nou, precum și ecranele de Game Over (cu motivul încălcării) și de victorie. Mai jos, un fragment dintr-un jurnal real:</w:t>
+      </w:r>
+    </w:p>
+    <w:p>
+      <w:pPr>
+        <w:spacing w:after="0" w:line="240" w:lineRule="auto"/>
+        <w:shd w:val="clear" w:color="auto" w:fill="FBFBF0"/>
+      </w:pPr>
+      <w:r>
+        <w:rPr>
+          <w:rFonts w:ascii="Consolas" w:hAnsi="Consolas"/>
+          <w:sz w:val="16"/>
+        </w:rPr>
+        <w:t>----- sesiune noua (2026-06-03 17:32:17) -----</w:t>
+      </w:r>
+    </w:p>
+    <w:p>
+      <w:pPr>
+        <w:spacing w:after="0" w:line="240" w:lineRule="auto"/>
+        <w:shd w:val="clear" w:color="auto" w:fill="FBFBF0"/>
+      </w:pPr>
+      <w:r>
+        <w:rPr>
+          <w:rFonts w:ascii="Consolas" w:hAnsi="Consolas"/>
+          <w:sz w:val="16"/>
+        </w:rPr>
+        <w:t>[2026-06-03 17:32:18] Partida noua: tinta=5 intersectii; nivelul 1, regula=SEMAFOR</w:t>
+      </w:r>
+    </w:p>
+    <w:p>
+      <w:pPr>
+        <w:spacing w:after="0" w:line="240" w:lineRule="auto"/>
+        <w:shd w:val="clear" w:color="auto" w:fill="FBFBF0"/>
+      </w:pPr>
+      <w:r>
+        <w:rPr>
+          <w:rFonts w:ascii="Consolas" w:hAnsi="Consolas"/>
+          <w:sz w:val="16"/>
+        </w:rPr>
+        <w:t>[2026-06-03 17:32:19] Intrare in intersectie permisa (regula=SEMAFOR, stare=VERDE)</w:t>
+      </w:r>
+    </w:p>
+    <w:p>
+      <w:pPr>
+        <w:spacing w:after="0" w:line="240" w:lineRule="auto"/>
+        <w:shd w:val="clear" w:color="auto" w:fill="FBFBF0"/>
+      </w:pPr>
+      <w:r>
+        <w:rPr>
+          <w:rFonts w:ascii="Consolas" w:hAnsi="Consolas"/>
+          <w:sz w:val="16"/>
+        </w:rPr>
+        <w:t>[2026-06-03 17:32:20] Iesire din intersectie: trecere reusita +100 (scor=100, total=1/5)</w:t>
+      </w:r>
+    </w:p>
+    <w:p>
+      <w:pPr>
+        <w:spacing w:after="0" w:line="240" w:lineRule="auto"/>
+        <w:shd w:val="clear" w:color="auto" w:fill="FBFBF0"/>
+      </w:pPr>
+      <w:r>
+        <w:rPr>
+          <w:rFonts w:ascii="Consolas" w:hAnsi="Consolas"/>
+          <w:sz w:val="16"/>
+        </w:rPr>
+        <w:t>[2026-06-03 17:32:20] Nivel nou 2: regula=PRIORITATE DREAPTA</w:t>
+      </w:r>
+    </w:p>
+    <w:p>
+      <w:pPr>
+        <w:spacing w:after="0" w:line="240" w:lineRule="auto"/>
+        <w:shd w:val="clear" w:color="auto" w:fill="FBFBF0"/>
+      </w:pPr>
+      <w:r>
+        <w:rPr>
+          <w:rFonts w:ascii="Consolas" w:hAnsi="Consolas"/>
+          <w:sz w:val="16"/>
+        </w:rPr>
+        <w:t>----- sesiune incheiata (2026-06-03 17:32:22) -----</w:t>
+      </w:r>
+    </w:p>
+    <w:p>
       <w:r>
         <w:br w:type="page"/>
       </w:r>
@@ -5200,6 +5848,262 @@
     </w:p>
     <w:p>
       <w:pPr>
+        <w:pStyle w:val="Heading2"/>
+      </w:pPr>
+      <w:r>
+        <w:t>9.1. Colorarea fundalului</w:t>
+      </w:r>
+    </w:p>
+    <w:p>
+      <w:pPr>
+        <w:jc w:val="both"/>
+      </w:pPr>
+      <w:r>
+        <w:rPr>
+          <w:b w:val="0"/>
+          <w:i w:val="0"/>
+        </w:rPr>
+        <w:t>Pentru un aspect mai apropiat de o hartă reală, caracterele fundalului static sunt colorate cu ajutorul secvențelor ANSI de culoare, în funcție de rolul fiecărui caracter. Colorarea se face o singură dată, la desenarea fundalului, printr-o metodă dedicată (coloreaza()), astfel încât să nu afecteze performanța redesenării selective a vehiculelor.</w:t>
+      </w:r>
+    </w:p>
+    <w:tbl>
+      <w:tblPr>
+        <w:tblStyle w:val="LightGrid-Accent1"/>
+        <w:tblW w:type="auto" w:w="0"/>
+        <w:jc w:val="center"/>
+        <w:tblLook w:firstColumn="1" w:firstRow="1" w:lastColumn="0" w:lastRow="0" w:noHBand="0" w:noVBand="1" w:val="04A0"/>
+      </w:tblPr>
+      <w:tblGrid>
+        <w:gridCol w:w="3024"/>
+        <w:gridCol w:w="3024"/>
+        <w:gridCol w:w="3024"/>
+      </w:tblGrid>
+      <w:tr>
+        <w:tc>
+          <w:tcPr>
+            <w:tcW w:type="dxa" w:w="4535"/>
+          </w:tcPr>
+          <w:p>
+            <w:r/>
+            <w:r>
+              <w:rPr>
+                <w:b/>
+                <w:sz w:val="22"/>
+              </w:rPr>
+              <w:t>Element</w:t>
+            </w:r>
+          </w:p>
+        </w:tc>
+        <w:tc>
+          <w:tcPr>
+            <w:tcW w:type="dxa" w:w="2268"/>
+          </w:tcPr>
+          <w:p>
+            <w:r/>
+            <w:r>
+              <w:rPr>
+                <w:b/>
+                <w:sz w:val="22"/>
+              </w:rPr>
+              <w:t>Caracter</w:t>
+            </w:r>
+          </w:p>
+        </w:tc>
+        <w:tc>
+          <w:tcPr>
+            <w:tcW w:type="dxa" w:w="2268"/>
+          </w:tcPr>
+          <w:p>
+            <w:r/>
+            <w:r>
+              <w:rPr>
+                <w:b/>
+                <w:sz w:val="22"/>
+              </w:rPr>
+              <w:t>Culoare</w:t>
+            </w:r>
+          </w:p>
+        </w:tc>
+      </w:tr>
+      <w:tr>
+        <w:tc>
+          <w:tcPr>
+            <w:tcW w:type="dxa" w:w="4535"/>
+          </w:tcPr>
+          <w:p>
+            <w:r/>
+            <w:r>
+              <w:rPr>
+                <w:sz w:val="22"/>
+              </w:rPr>
+              <w:t>Marcaje rutiere (linii întrerupte de bandă)</w:t>
+            </w:r>
+          </w:p>
+        </w:tc>
+        <w:tc>
+          <w:tcPr>
+            <w:tcW w:type="dxa" w:w="2268"/>
+          </w:tcPr>
+          <w:p>
+            <w:r/>
+            <w:r>
+              <w:rPr>
+                <w:sz w:val="22"/>
+              </w:rPr>
+              <w:t>|  -</w:t>
+            </w:r>
+          </w:p>
+        </w:tc>
+        <w:tc>
+          <w:tcPr>
+            <w:tcW w:type="dxa" w:w="2268"/>
+          </w:tcPr>
+          <w:p>
+            <w:r/>
+            <w:r>
+              <w:rPr>
+                <w:sz w:val="22"/>
+              </w:rPr>
+              <w:t>galben</w:t>
+            </w:r>
+          </w:p>
+        </w:tc>
+      </w:tr>
+      <w:tr>
+        <w:tc>
+          <w:tcPr>
+            <w:tcW w:type="dxa" w:w="4535"/>
+          </w:tcPr>
+          <w:p>
+            <w:r/>
+            <w:r>
+              <w:rPr>
+                <w:sz w:val="22"/>
+              </w:rPr>
+              <w:t>Pereții / clădirile din jur</w:t>
+            </w:r>
+          </w:p>
+        </w:tc>
+        <w:tc>
+          <w:tcPr>
+            <w:tcW w:type="dxa" w:w="2268"/>
+          </w:tcPr>
+          <w:p>
+            <w:r/>
+            <w:r>
+              <w:rPr>
+                <w:sz w:val="22"/>
+              </w:rPr>
+              <w:t>*</w:t>
+            </w:r>
+          </w:p>
+        </w:tc>
+        <w:tc>
+          <w:tcPr>
+            <w:tcW w:type="dxa" w:w="2268"/>
+          </w:tcPr>
+          <w:p>
+            <w:r/>
+            <w:r>
+              <w:rPr>
+                <w:sz w:val="22"/>
+              </w:rPr>
+              <w:t>gri</w:t>
+            </w:r>
+          </w:p>
+        </w:tc>
+      </w:tr>
+      <w:tr>
+        <w:tc>
+          <w:tcPr>
+            <w:tcW w:type="dxa" w:w="4535"/>
+          </w:tcPr>
+          <w:p>
+            <w:r/>
+            <w:r>
+              <w:rPr>
+                <w:sz w:val="22"/>
+              </w:rPr>
+              <w:t>Liniile de stop la intersecție</w:t>
+            </w:r>
+          </w:p>
+        </w:tc>
+        <w:tc>
+          <w:tcPr>
+            <w:tcW w:type="dxa" w:w="2268"/>
+          </w:tcPr>
+          <w:p>
+            <w:r/>
+            <w:r>
+              <w:rPr>
+                <w:sz w:val="22"/>
+              </w:rPr>
+              <w:t>=  :</w:t>
+            </w:r>
+          </w:p>
+        </w:tc>
+        <w:tc>
+          <w:tcPr>
+            <w:tcW w:type="dxa" w:w="2268"/>
+          </w:tcPr>
+          <w:p>
+            <w:r/>
+            <w:r>
+              <w:rPr>
+                <w:sz w:val="22"/>
+              </w:rPr>
+              <w:t>alb</w:t>
+            </w:r>
+          </w:p>
+        </w:tc>
+      </w:tr>
+      <w:tr>
+        <w:tc>
+          <w:tcPr>
+            <w:tcW w:type="dxa" w:w="4535"/>
+          </w:tcPr>
+          <w:p>
+            <w:r/>
+            <w:r>
+              <w:rPr>
+                <w:sz w:val="22"/>
+              </w:rPr>
+              <w:t>Iarba din colțuri</w:t>
+            </w:r>
+          </w:p>
+        </w:tc>
+        <w:tc>
+          <w:tcPr>
+            <w:tcW w:type="dxa" w:w="2268"/>
+          </w:tcPr>
+          <w:p>
+            <w:r/>
+            <w:r>
+              <w:rPr>
+                <w:sz w:val="22"/>
+              </w:rPr>
+              <w:t>.</w:t>
+            </w:r>
+          </w:p>
+        </w:tc>
+        <w:tc>
+          <w:tcPr>
+            <w:tcW w:type="dxa" w:w="2268"/>
+          </w:tcPr>
+          <w:p>
+            <w:r/>
+            <w:r>
+              <w:rPr>
+                <w:sz w:val="22"/>
+              </w:rPr>
+              <w:t>verde</w:t>
+            </w:r>
+          </w:p>
+        </w:tc>
+      </w:tr>
+    </w:tbl>
+    <w:p>
+      <w:pPr>
         <w:pStyle w:val="Heading1"/>
       </w:pPr>
       <w:r>
@@ -5642,7 +6546,7 @@
           <w:b w:val="0"/>
           <w:i w:val="0"/>
         </w:rPr>
-        <w:t>Validarea aplicației s-a făcut pe două planuri. În primul rând, fiecare etapă de dezvoltare a fost compilată cu opțiunile -Wall -Wextra, fără avertismente, pe Ubuntu cu g++ 13. În al doilea rând, comportamentul jocului a fost verificat prin rulare efectivă într-un pseudo-terminal, simulând apăsări de taste și reconstruind ecranul afișat, pentru a confirma:</w:t>
+        <w:t>Validarea aplicației s-a făcut pe trei planuri. În primul rând, fiecare etapă de dezvoltare a fost compilată cu opțiunile -Wall -Wextra, fără avertismente, pe Ubuntu cu g++ 13. În al doilea rând, comportamentul jocului a fost verificat prin rulare efectivă într-un pseudo-terminal, simulând apăsări de taste și reconstruind ecranul afișat, pentru a confirma:</w:t>
       </w:r>
     </w:p>
     <w:p>
@@ -5688,6 +6592,14 @@
       </w:pPr>
       <w:r>
         <w:t>detectarea coliziunilor și păstrarea distanței între vehicule.</w:t>
+      </w:r>
+    </w:p>
+    <w:p>
+      <w:pPr>
+        <w:pStyle w:val="Heading2"/>
+      </w:pPr>
+      <w:r>
+        <w:t>12.1. Teste unitare</w:t>
       </w:r>
     </w:p>
     <w:p>
@@ -5699,7 +6611,234 @@
           <w:b w:val="0"/>
           <w:i w:val="0"/>
         </w:rPr>
-        <w:t>Ca direcție de continuare, proiectul prevede un director tests/ destinat testelor unitare simple (fără biblioteci externe) pentru logica de deplasare și validarea regulilor.</w:t>
+        <w:t>În al treilea rând, proiectul include un set de teste unitare automate în directorul tests/, fără dependențe externe. Acestea se construiesc și se rulează cu o singură comandă (make test), fiecare fișier de test devenind un executabil separat care întoarce codul de ieșire 0 doar dacă toate verificările trec. Pentru a evita orice bibliotecă externă, a fost scris un micro-framework propriu (Test.h), cu macro-urile CHECK și CHECK_EQ:</w:t>
+      </w:r>
+    </w:p>
+    <w:p>
+      <w:pPr>
+        <w:spacing w:after="0" w:line="240" w:lineRule="auto"/>
+        <w:shd w:val="clear" w:color="auto" w:fill="F4F4F4"/>
+      </w:pPr>
+      <w:r>
+        <w:rPr>
+          <w:rFonts w:ascii="Consolas" w:hAnsi="Consolas"/>
+          <w:sz w:val="18"/>
+        </w:rPr>
+        <w:t>#define CHECK(expr)    inregistreaza((expr), #expr, __FILE__, __LINE__)</w:t>
+      </w:r>
+    </w:p>
+    <w:p>
+      <w:pPr>
+        <w:spacing w:after="0" w:line="240" w:lineRule="auto"/>
+        <w:shd w:val="clear" w:color="auto" w:fill="F4F4F4"/>
+      </w:pPr>
+      <w:r>
+        <w:rPr>
+          <w:rFonts w:ascii="Consolas" w:hAnsi="Consolas"/>
+          <w:sz w:val="18"/>
+        </w:rPr>
+        <w:t>#define CHECK_EQ(a, b)  inregistreazaEgal((a), (b), ...)</w:t>
+      </w:r>
+    </w:p>
+    <w:p>
+      <w:pPr>
+        <w:spacing w:after="0" w:line="240" w:lineRule="auto"/>
+        <w:shd w:val="clear" w:color="auto" w:fill="F4F4F4"/>
+      </w:pPr>
+      <w:r>
+        <w:rPr>
+          <w:rFonts w:ascii="Consolas" w:hAnsi="Consolas"/>
+          <w:sz w:val="18"/>
+        </w:rPr>
+        <w:t>// rezumat() intoarce numarul de esecuri -&gt; exit code pentru Makefile</w:t>
+      </w:r>
+    </w:p>
+    <w:p>
+      <w:pPr>
+        <w:jc w:val="both"/>
+      </w:pPr>
+      <w:r>
+        <w:rPr>
+          <w:b w:val="0"/>
+          <w:i w:val="0"/>
+        </w:rPr>
+        <w:t>Testele acoperă logica independentă de terminal a aplicației:</w:t>
+      </w:r>
+    </w:p>
+    <w:tbl>
+      <w:tblPr>
+        <w:tblStyle w:val="LightGrid-Accent1"/>
+        <w:tblW w:type="auto" w:w="0"/>
+        <w:jc w:val="center"/>
+        <w:tblLook w:firstColumn="1" w:firstRow="1" w:lastColumn="0" w:lastRow="0" w:noHBand="0" w:noVBand="1" w:val="04A0"/>
+      </w:tblPr>
+      <w:tblGrid>
+        <w:gridCol w:w="4536"/>
+        <w:gridCol w:w="4536"/>
+      </w:tblGrid>
+      <w:tr>
+        <w:tc>
+          <w:tcPr>
+            <w:tcW w:type="dxa" w:w="2268"/>
+          </w:tcPr>
+          <w:p>
+            <w:r/>
+            <w:r>
+              <w:rPr>
+                <w:b/>
+                <w:sz w:val="22"/>
+              </w:rPr>
+              <w:t>Fișier de test</w:t>
+            </w:r>
+          </w:p>
+        </w:tc>
+        <w:tc>
+          <w:tcPr>
+            <w:tcW w:type="dxa" w:w="6803"/>
+          </w:tcPr>
+          <w:p>
+            <w:r/>
+            <w:r>
+              <w:rPr>
+                <w:b/>
+                <w:sz w:val="22"/>
+              </w:rPr>
+              <w:t>Ce verifică</w:t>
+            </w:r>
+          </w:p>
+        </w:tc>
+      </w:tr>
+      <w:tr>
+        <w:tc>
+          <w:tcPr>
+            <w:tcW w:type="dxa" w:w="2268"/>
+          </w:tcPr>
+          <w:p>
+            <w:r/>
+            <w:r>
+              <w:rPr>
+                <w:sz w:val="22"/>
+              </w:rPr>
+              <w:t>test_vehicul</w:t>
+            </w:r>
+          </w:p>
+        </w:tc>
+        <w:tc>
+          <w:tcPr>
+            <w:tcW w:type="dxa" w:w="6803"/>
+          </w:tcPr>
+          <w:p>
+            <w:r/>
+            <w:r>
+              <w:rPr>
+                <w:sz w:val="22"/>
+              </w:rPr>
+              <w:t>Moștenire și polimorfism (tip, viteză maximă), dimensiunile sprite-ului, ocupaCelula, rotirea la schimbarea direcției</w:t>
+            </w:r>
+          </w:p>
+        </w:tc>
+      </w:tr>
+      <w:tr>
+        <w:tc>
+          <w:tcPr>
+            <w:tcW w:type="dxa" w:w="2268"/>
+          </w:tcPr>
+          <w:p>
+            <w:r/>
+            <w:r>
+              <w:rPr>
+                <w:sz w:val="22"/>
+              </w:rPr>
+              <w:t>test_reguli</w:t>
+            </w:r>
+          </w:p>
+        </w:tc>
+        <w:tc>
+          <w:tcPr>
+            <w:tcW w:type="dxa" w:w="6803"/>
+          </w:tcPr>
+          <w:p>
+            <w:r/>
+            <w:r>
+              <w:rPr>
+                <w:sz w:val="22"/>
+              </w:rPr>
+              <w:t>Semaforul (verde permite, roșu interzice, ciclul de culori), prioritatea de dreapta (liber/cedează) și regula STOP</w:t>
+            </w:r>
+          </w:p>
+        </w:tc>
+      </w:tr>
+      <w:tr>
+        <w:tc>
+          <w:tcPr>
+            <w:tcW w:type="dxa" w:w="2268"/>
+          </w:tcPr>
+          <w:p>
+            <w:r/>
+            <w:r>
+              <w:rPr>
+                <w:sz w:val="22"/>
+              </w:rPr>
+              <w:t>test_harta</w:t>
+            </w:r>
+          </w:p>
+        </w:tc>
+        <w:tc>
+          <w:tcPr>
+            <w:tcW w:type="dxa" w:w="6803"/>
+          </w:tcPr>
+          <w:p>
+            <w:r/>
+            <w:r>
+              <w:rPr>
+                <w:sz w:val="22"/>
+              </w:rPr>
+              <w:t>Geometria intersecției, esteAsfalt / esteInIntersectie și detectarea contrasensului pe ambele benzi</w:t>
+            </w:r>
+          </w:p>
+        </w:tc>
+      </w:tr>
+      <w:tr>
+        <w:tc>
+          <w:tcPr>
+            <w:tcW w:type="dxa" w:w="2268"/>
+          </w:tcPr>
+          <w:p>
+            <w:r/>
+            <w:r>
+              <w:rPr>
+                <w:sz w:val="22"/>
+              </w:rPr>
+              <w:t>test_logger</w:t>
+            </w:r>
+          </w:p>
+        </w:tc>
+        <w:tc>
+          <w:tcPr>
+            <w:tcW w:type="dxa" w:w="6803"/>
+          </w:tcPr>
+          <w:p>
+            <w:r/>
+            <w:r>
+              <w:rPr>
+                <w:sz w:val="22"/>
+              </w:rPr>
+              <w:t>Scrierea evenimentelor în fișier, prezența mărcii temporale și funcționarea modului „append"</w:t>
+            </w:r>
+          </w:p>
+        </w:tc>
+      </w:tr>
+    </w:tbl>
+    <w:p>
+      <w:pPr>
+        <w:jc w:val="both"/>
+      </w:pPr>
+      <w:r>
+        <w:rPr>
+          <w:b w:val="0"/>
+          <w:i w:val="0"/>
+        </w:rPr>
+        <w:t>La ultima rulare, toate cele 60 de verificări din cele patru fișiere de test au trecut cu succes, confirmând corectitudinea logicii de bază independent de interfața în consolă.</w:t>
       </w:r>
     </w:p>
     <w:p>
@@ -5918,7 +7057,7 @@
         <w:jc w:val="both"/>
       </w:pPr>
       <w:r>
-        <w:t>Pattern-ul Observer pentru notificarea evenimentelor (intrare/ieșire intersecție, coliziune) către mai mulți „ascultători" (jurnal, scor, statistici).</w:t>
+        <w:t>Pattern-ul Observer pentru notificarea evenimentelor (intrare/ieșire intersecție, coliziune) către mai mulți „ascultători", pornind de la jurnalul de evenimente deja existent.</w:t>
       </w:r>
     </w:p>
     <w:p>
@@ -5927,7 +7066,7 @@
         <w:jc w:val="both"/>
       </w:pPr>
       <w:r>
-        <w:t>Jurnalizarea evenimentelor într-un fișier și exportul statisticilor în format CSV.</w:t>
+        <w:t>Exportul statisticilor de joc în format CSV, pe baza evenimentelor înregistrate în jurnal.</w:t>
       </w:r>
     </w:p>
     <w:p>
@@ -5936,7 +7075,7 @@
         <w:jc w:val="both"/>
       </w:pPr>
       <w:r>
-        <w:t>Hărți mai mari, cu mai multe intersecții și o cameră care urmărește jucătorul.</w:t>
+        <w:t>Clase explicite Strada și ReteaRutiera care să gestioneze traficul, mutând această responsabilitate din clasa Joc și accentuând relația de compoziție.</w:t>
       </w:r>
     </w:p>
     <w:p>
@@ -5945,7 +7084,7 @@
         <w:jc w:val="both"/>
       </w:pPr>
       <w:r>
-        <w:t>Viraje complete la intersecție, cu rotirea mașinii și trecerea pe drumul transversal.</w:t>
+        <w:t>Hărți mai mari, cu mai multe intersecții și o cameră care urmărește jucătorul.</w:t>
       </w:r>
     </w:p>
     <w:p>
@@ -5954,7 +7093,7 @@
         <w:jc w:val="both"/>
       </w:pPr>
       <w:r>
-        <w:t>Teste unitare automate și integrare continuă (CI) pe GitHub.</w:t>
+        <w:t>Viraje complete la intersecție, cu rotirea mașinii și trecerea pe drumul transversal.</w:t>
       </w:r>
     </w:p>
     <w:p>
@@ -5963,7 +7102,16 @@
         <w:jc w:val="both"/>
       </w:pPr>
       <w:r>
-        <w:t>Sunete prin „beep"-ul terminalului și un meniu principal.</w:t>
+        <w:t>Integrare continuă (CI) pe GitHub, care să ruleze automat testele unitare existente.</w:t>
+      </w:r>
+    </w:p>
+    <w:p>
+      <w:pPr>
+        <w:pStyle w:val="ListBullet"/>
+        <w:jc w:val="both"/>
+      </w:pPr>
+      <w:r>
+        <w:t>Sunete prin „beep"-ul terminalului și efecte sonore la evenimentele importante.</w:t>
       </w:r>
     </w:p>
     <w:p>

</xml_diff>